<commit_message>
scorecard update Fed resolved
</commit_message>
<xml_diff>
--- a/reports/scorecards/AFG_Scorecard_2026-07-31.docx
+++ b/reports/scorecards/AFG_Scorecard_2026-07-31.docx
@@ -102,7 +102,7 @@
                 <w:color w:val="17365D"/>
                 <w:sz w:val="44"/>
               </w:rPr>
-              <w:t>2</w:t>
+              <w:t>3</w:t>
             </w:r>
           </w:p>
           <w:p>
@@ -147,7 +147,7 @@
                 <w:color w:val="1F6F3D"/>
                 <w:sz w:val="44"/>
               </w:rPr>
-              <w:t>1</w:t>
+              <w:t>2</w:t>
             </w:r>
           </w:p>
           <w:p>
@@ -237,7 +237,7 @@
                 <w:color w:val="17365D"/>
                 <w:sz w:val="44"/>
               </w:rPr>
-              <w:t>0.190</w:t>
+              <w:t>0.132</w:t>
             </w:r>
           </w:p>
           <w:p>
@@ -282,7 +282,7 @@
           <w:color w:val="17365D"/>
           <w:sz w:val="26"/>
         </w:rPr>
-        <w:t>50%</w:t>
+        <w:t>67%</w:t>
       </w:r>
       <w:r>
         <w:rPr>
@@ -299,10 +299,10 @@
           <w:rFonts w:ascii="Cambria" w:hAnsi="Cambria"/>
           <w:b/>
           <w:i w:val="0"/>
-          <w:color w:val="A6231F"/>
+          <w:color w:val="1F6F3D"/>
           <w:sz w:val="21"/>
         </w:rPr>
-        <w:t>trails the Kalshi market</w:t>
+        <w:t>beats the Kalshi market</w:t>
       </w:r>
       <w:r>
         <w:rPr>
@@ -312,7 +312,7 @@
           <w:color w:val="808080"/>
           <w:sz w:val="21"/>
         </w:rPr>
-        <w:t xml:space="preserve"> by 0.003 Brier points</w:t>
+        <w:t xml:space="preserve"> by 0.014 Brier points</w:t>
       </w:r>
       <w:r>
         <w:rPr>
@@ -322,7 +322,7 @@
           <w:color w:val="808080"/>
           <w:sz w:val="19"/>
         </w:rPr>
-        <w:t xml:space="preserve">  (Market Brier: 0.187)</w:t>
+        <w:t xml:space="preserve">  (Market Brier: 0.146)</w:t>
       </w:r>
     </w:p>
     <w:p>
@@ -741,7 +741,7 @@
                 <w:color w:val="808080"/>
                 <w:sz w:val="19"/>
               </w:rPr>
-              <w:t>—</w:t>
+              <w:t>1</w:t>
             </w:r>
           </w:p>
         </w:tc>
@@ -765,10 +765,10 @@
                 <w:rFonts w:ascii="Cambria" w:hAnsi="Cambria"/>
                 <w:b w:val="0"/>
                 <w:i w:val="0"/>
-                <w:color w:val="808080"/>
+                <w:color w:val="1F6F3D"/>
                 <w:sz w:val="19"/>
               </w:rPr>
-              <w:t>—</w:t>
+              <w:t>1</w:t>
             </w:r>
           </w:p>
         </w:tc>
@@ -792,10 +792,10 @@
                 <w:rFonts w:ascii="Cambria" w:hAnsi="Cambria"/>
                 <w:b w:val="0"/>
                 <w:i w:val="0"/>
-                <w:color w:val="808080"/>
+                <w:color w:val="A6231F"/>
                 <w:sz w:val="19"/>
               </w:rPr>
-              <w:t>—</w:t>
+              <w:t>0</w:t>
             </w:r>
           </w:p>
         </w:tc>
@@ -819,10 +819,10 @@
                 <w:rFonts w:ascii="Cambria" w:hAnsi="Cambria"/>
                 <w:b w:val="0"/>
                 <w:i w:val="0"/>
-                <w:color w:val="808080"/>
+                <w:color w:val="17365D"/>
                 <w:sz w:val="19"/>
               </w:rPr>
-              <w:t>—</w:t>
+              <w:t>100%</w:t>
             </w:r>
           </w:p>
         </w:tc>
@@ -846,10 +846,10 @@
                 <w:rFonts w:ascii="Cambria" w:hAnsi="Cambria"/>
                 <w:b w:val="0"/>
                 <w:i w:val="0"/>
-                <w:color w:val="808080"/>
+                <w:color w:val="17365D"/>
                 <w:sz w:val="19"/>
               </w:rPr>
-              <w:t>—</w:t>
+              <w:t>0.014</w:t>
             </w:r>
           </w:p>
         </w:tc>
@@ -1601,6 +1601,197 @@
                 <w:color w:val="17365D"/>
                 <w:sz w:val="18"/>
               </w:rPr>
+              <w:t>Fed decision in July — Maintains rate</w:t>
+            </w:r>
+          </w:p>
+        </w:tc>
+        <w:tc>
+          <w:tcPr>
+            <w:tcBorders>
+              <w:top w:val="single" w:sz="2" w:color="B0B8C8"/>
+              <w:left w:val="single" w:sz="2" w:color="B0B8C8"/>
+              <w:bottom w:val="single" w:sz="2" w:color="B0B8C8"/>
+              <w:right w:val="single" w:sz="2" w:color="B0B8C8"/>
+            </w:tcBorders>
+            <w:tcW w:w="1300" w:type="dxa"/>
+          </w:tcPr>
+          <w:p>
+            <w:pPr>
+              <w:spacing w:before="60" w:after="60"/>
+            </w:pPr>
+            <w:r/>
+            <w:r>
+              <w:rPr>
+                <w:rFonts w:ascii="Cambria" w:hAnsi="Cambria"/>
+                <w:b w:val="0"/>
+                <w:i w:val="0"/>
+                <w:color w:val="808080"/>
+                <w:sz w:val="18"/>
+              </w:rPr>
+              <w:t>Economics</w:t>
+            </w:r>
+          </w:p>
+        </w:tc>
+        <w:tc>
+          <w:tcPr>
+            <w:tcBorders>
+              <w:top w:val="single" w:sz="2" w:color="B0B8C8"/>
+              <w:left w:val="single" w:sz="2" w:color="B0B8C8"/>
+              <w:bottom w:val="single" w:sz="2" w:color="B0B8C8"/>
+              <w:right w:val="single" w:sz="2" w:color="B0B8C8"/>
+            </w:tcBorders>
+            <w:tcW w:w="800" w:type="dxa"/>
+          </w:tcPr>
+          <w:p>
+            <w:pPr>
+              <w:spacing w:before="60" w:after="60"/>
+            </w:pPr>
+            <w:r/>
+            <w:r>
+              <w:rPr>
+                <w:rFonts w:ascii="Cambria" w:hAnsi="Cambria"/>
+                <w:b w:val="0"/>
+                <w:i w:val="0"/>
+                <w:color w:val="808080"/>
+                <w:sz w:val="18"/>
+              </w:rPr>
+              <w:t>86%</w:t>
+            </w:r>
+          </w:p>
+        </w:tc>
+        <w:tc>
+          <w:tcPr>
+            <w:tcBorders>
+              <w:top w:val="single" w:sz="2" w:color="B0B8C8"/>
+              <w:left w:val="single" w:sz="2" w:color="B0B8C8"/>
+              <w:bottom w:val="single" w:sz="2" w:color="B0B8C8"/>
+              <w:right w:val="single" w:sz="2" w:color="B0B8C8"/>
+            </w:tcBorders>
+            <w:tcW w:w="800" w:type="dxa"/>
+          </w:tcPr>
+          <w:p>
+            <w:pPr>
+              <w:spacing w:before="60" w:after="60"/>
+            </w:pPr>
+            <w:r/>
+            <w:r>
+              <w:rPr>
+                <w:rFonts w:ascii="Cambria" w:hAnsi="Cambria"/>
+                <w:b w:val="0"/>
+                <w:i w:val="0"/>
+                <w:color w:val="17365D"/>
+                <w:sz w:val="18"/>
+              </w:rPr>
+              <w:t>93%</w:t>
+            </w:r>
+          </w:p>
+        </w:tc>
+        <w:tc>
+          <w:tcPr>
+            <w:tcBorders>
+              <w:top w:val="single" w:sz="2" w:color="B0B8C8"/>
+              <w:left w:val="single" w:sz="2" w:color="B0B8C8"/>
+              <w:bottom w:val="single" w:sz="2" w:color="B0B8C8"/>
+              <w:right w:val="single" w:sz="2" w:color="B0B8C8"/>
+            </w:tcBorders>
+            <w:tcW w:w="1300" w:type="dxa"/>
+          </w:tcPr>
+          <w:p>
+            <w:pPr>
+              <w:spacing w:before="60" w:after="60"/>
+            </w:pPr>
+            <w:r/>
+            <w:r>
+              <w:rPr>
+                <w:rFonts w:ascii="Cambria" w:hAnsi="Cambria"/>
+                <w:b/>
+                <w:i w:val="0"/>
+                <w:color w:val="1F6F3D"/>
+                <w:sz w:val="18"/>
+              </w:rPr>
+              <w:t>BUY YES</w:t>
+            </w:r>
+          </w:p>
+        </w:tc>
+        <w:tc>
+          <w:tcPr>
+            <w:tcBorders>
+              <w:top w:val="single" w:sz="2" w:color="B0B8C8"/>
+              <w:left w:val="single" w:sz="2" w:color="B0B8C8"/>
+              <w:bottom w:val="single" w:sz="2" w:color="B0B8C8"/>
+              <w:right w:val="single" w:sz="2" w:color="B0B8C8"/>
+            </w:tcBorders>
+            <w:tcW w:w="1000" w:type="dxa"/>
+          </w:tcPr>
+          <w:p>
+            <w:pPr>
+              <w:spacing w:before="60" w:after="60"/>
+            </w:pPr>
+            <w:r/>
+            <w:r>
+              <w:rPr>
+                <w:rFonts w:ascii="Cambria" w:hAnsi="Cambria"/>
+                <w:b w:val="0"/>
+                <w:i w:val="0"/>
+                <w:color w:val="808080"/>
+                <w:sz w:val="18"/>
+              </w:rPr>
+              <w:t>YES</w:t>
+            </w:r>
+          </w:p>
+        </w:tc>
+        <w:tc>
+          <w:tcPr>
+            <w:tcBorders>
+              <w:top w:val="single" w:sz="2" w:color="B0B8C8"/>
+              <w:left w:val="single" w:sz="2" w:color="B0B8C8"/>
+              <w:bottom w:val="single" w:sz="2" w:color="B0B8C8"/>
+              <w:right w:val="single" w:sz="2" w:color="B0B8C8"/>
+            </w:tcBorders>
+            <w:tcW w:w="2100" w:type="dxa"/>
+          </w:tcPr>
+          <w:p>
+            <w:pPr>
+              <w:spacing w:before="60" w:after="60"/>
+            </w:pPr>
+            <w:r/>
+            <w:r>
+              <w:rPr>
+                <w:rFonts w:ascii="Cambria" w:hAnsi="Cambria"/>
+                <w:b/>
+                <w:i w:val="0"/>
+                <w:color w:val="1F6F3D"/>
+                <w:sz w:val="18"/>
+              </w:rPr>
+              <w:t>✓ Correct</w:t>
+            </w:r>
+          </w:p>
+        </w:tc>
+      </w:tr>
+      <w:tr>
+        <w:tc>
+          <w:tcPr>
+            <w:tcBorders>
+              <w:top w:val="single" w:sz="2" w:color="B0B8C8"/>
+              <w:left w:val="single" w:sz="2" w:color="B0B8C8"/>
+              <w:bottom w:val="single" w:sz="2" w:color="B0B8C8"/>
+              <w:right w:val="single" w:sz="2" w:color="B0B8C8"/>
+            </w:tcBorders>
+            <w:tcW w:w="3500" w:type="dxa"/>
+          </w:tcPr>
+          <w:p>
+            <w:pPr>
+              <w:spacing w:before="60" w:after="60"/>
+            </w:pPr>
+            <w:r/>
+            <w:r>
+              <w:rPr>
+                <w:rFonts w:ascii="Cambria" w:hAnsi="Cambria"/>
+                <w:b w:val="0"/>
+                <w:i w:val="0"/>
+                <w:color w:val="17365D"/>
+                <w:sz w:val="18"/>
+              </w:rPr>
               <w:t>LeBron James Next Team — Cleveland Cavaliers</w:t>
             </w:r>
           </w:p>

</xml_diff>